<commit_message>
rerun mdarahman sweep against updated backend
</commit_message>
<xml_diff>
--- a/data/mdarahman/mdarahman_data.docx
+++ b/data/mdarahman/mdarahman_data.docx
@@ -606,7 +606,7 @@
       <w:r>
         <w:drawing>
           <wp:inline xmlns:a="http://schemas.openxmlformats.org/drawingml/2006/main" xmlns:pic="http://schemas.openxmlformats.org/drawingml/2006/picture">
-            <wp:extent cx="5486400" cy="3411997"/>
+            <wp:extent cx="5486400" cy="3480309"/>
             <wp:docPr id="1" name="Picture 1"/>
             <wp:cNvGraphicFramePr>
               <a:graphicFrameLocks noChangeAspect="1"/>
@@ -627,7 +627,7 @@
                   <pic:spPr>
                     <a:xfrm>
                       <a:off x="0" y="0"/>
-                      <a:ext cx="5486400" cy="3411997"/>
+                      <a:ext cx="5486400" cy="3480309"/>
                     </a:xfrm>
                     <a:prstGeom prst="rect"/>
                   </pic:spPr>
@@ -731,7 +731,7 @@
           </w:tcPr>
           <w:p>
             <w:r>
-              <w:t>5.2</w:t>
+              <w:t>16.2</w:t>
             </w:r>
           </w:p>
         </w:tc>
@@ -741,7 +741,7 @@
           </w:tcPr>
           <w:p>
             <w:r>
-              <w:t>1.98</w:t>
+              <w:t>2.77</w:t>
             </w:r>
           </w:p>
         </w:tc>
@@ -773,7 +773,7 @@
           </w:tcPr>
           <w:p>
             <w:r>
-              <w:t>5.2</w:t>
+              <w:t>8.9</w:t>
             </w:r>
           </w:p>
         </w:tc>
@@ -783,7 +783,7 @@
           </w:tcPr>
           <w:p>
             <w:r>
-              <w:t>2.01</w:t>
+              <w:t>2.37</w:t>
             </w:r>
           </w:p>
         </w:tc>
@@ -815,7 +815,7 @@
           </w:tcPr>
           <w:p>
             <w:r>
-              <w:t>6.3</w:t>
+              <w:t>5.3</w:t>
             </w:r>
           </w:p>
         </w:tc>
@@ -825,7 +825,7 @@
           </w:tcPr>
           <w:p>
             <w:r>
-              <w:t>2.16</w:t>
+              <w:t>2.12</w:t>
             </w:r>
           </w:p>
         </w:tc>
@@ -857,7 +857,7 @@
           </w:tcPr>
           <w:p>
             <w:r>
-              <w:t>6.8</w:t>
+              <w:t>5.2</w:t>
             </w:r>
           </w:p>
         </w:tc>
@@ -867,7 +867,7 @@
           </w:tcPr>
           <w:p>
             <w:r>
-              <w:t>2.16</w:t>
+              <w:t>2.13</w:t>
             </w:r>
           </w:p>
         </w:tc>

</xml_diff>

<commit_message>
add ui screenshots to mdarahman report
</commit_message>
<xml_diff>
--- a/data/mdarahman/mdarahman_data.docx
+++ b/data/mdarahman/mdarahman_data.docx
@@ -590,6 +590,113 @@
         <w:pStyle w:val="Heading1"/>
       </w:pPr>
       <w:r>
+        <w:t>1b. Run Evidence (UI Screenshots)</w:t>
+      </w:r>
+    </w:p>
+    <w:p>
+      <w:r>
+        <w:rPr>
+          <w:b w:val="0"/>
+          <w:sz w:val="22"/>
+        </w:rPr>
+        <w:t>Screenshot 1 - the live web UI at the team's deployed backend with my A_score_heavy config filled in (Pacman task, custom weights w1=0.9 / w2=0.09 / w3=0.01, generations=4, population=5, top_k=3, diversity selection, full LLM-guided + random_only checked, single_llm unchecked):</w:t>
+      </w:r>
+    </w:p>
+    <w:p>
+      <w:r>
+        <w:drawing>
+          <wp:inline xmlns:a="http://schemas.openxmlformats.org/drawingml/2006/main" xmlns:pic="http://schemas.openxmlformats.org/drawingml/2006/picture">
+            <wp:extent cx="5486400" cy="3915918"/>
+            <wp:docPr id="1" name="Picture 1"/>
+            <wp:cNvGraphicFramePr>
+              <a:graphicFrameLocks noChangeAspect="1"/>
+            </wp:cNvGraphicFramePr>
+            <a:graphic>
+              <a:graphicData uri="http://schemas.openxmlformats.org/drawingml/2006/picture">
+                <pic:pic>
+                  <pic:nvPicPr>
+                    <pic:cNvPr id="0" name="01_config_form.png"/>
+                    <pic:cNvPicPr/>
+                  </pic:nvPicPr>
+                  <pic:blipFill>
+                    <a:blip r:embed="rId9"/>
+                    <a:stretch>
+                      <a:fillRect/>
+                    </a:stretch>
+                  </pic:blipFill>
+                  <pic:spPr>
+                    <a:xfrm>
+                      <a:off x="0" y="0"/>
+                      <a:ext cx="5486400" cy="3915918"/>
+                    </a:xfrm>
+                    <a:prstGeom prst="rect"/>
+                  </pic:spPr>
+                </pic:pic>
+              </a:graphicData>
+            </a:graphic>
+          </wp:inline>
+        </w:drawing>
+      </w:r>
+    </w:p>
+    <w:p>
+      <w:r>
+        <w:rPr>
+          <w:b w:val="0"/>
+          <w:sz w:val="22"/>
+        </w:rPr>
+        <w:t>Screenshot 2 - same run after pressing 'Run evolution', showing the live best-fitness curve climbing from 895 to 961, the per-task metric panels (cost, steps, eval time), the comparison summary table (random_only 895.63 vs full 960.48), the evolved best candidate code, and the full evolution history with selection summaries:</w:t>
+      </w:r>
+    </w:p>
+    <w:p>
+      <w:r>
+        <w:drawing>
+          <wp:inline xmlns:a="http://schemas.openxmlformats.org/drawingml/2006/main" xmlns:pic="http://schemas.openxmlformats.org/drawingml/2006/picture">
+            <wp:extent cx="5486400" cy="7715250"/>
+            <wp:docPr id="2" name="Picture 2"/>
+            <wp:cNvGraphicFramePr>
+              <a:graphicFrameLocks noChangeAspect="1"/>
+            </wp:cNvGraphicFramePr>
+            <a:graphic>
+              <a:graphicData uri="http://schemas.openxmlformats.org/drawingml/2006/picture">
+                <pic:pic>
+                  <pic:nvPicPr>
+                    <pic:cNvPr id="0" name="03_final_result.png"/>
+                    <pic:cNvPicPr/>
+                  </pic:nvPicPr>
+                  <pic:blipFill>
+                    <a:blip r:embed="rId10"/>
+                    <a:stretch>
+                      <a:fillRect/>
+                    </a:stretch>
+                  </pic:blipFill>
+                  <pic:spPr>
+                    <a:xfrm>
+                      <a:off x="0" y="0"/>
+                      <a:ext cx="5486400" cy="7715250"/>
+                    </a:xfrm>
+                    <a:prstGeom prst="rect"/>
+                  </pic:spPr>
+                </pic:pic>
+              </a:graphicData>
+            </a:graphic>
+          </wp:inline>
+        </w:drawing>
+      </w:r>
+    </w:p>
+    <w:p>
+      <w:r>
+        <w:rPr>
+          <w:b w:val="0"/>
+          <w:sz w:val="22"/>
+        </w:rPr>
+        <w:t>All 4 weight configs in the sweep were run programmatically against the same backend with seed=42 (see sweep.py); the screenshots above are from the A_score_heavy config rerun manually in the browser as visual confirmation that the pipeline matches the API numbers.</w:t>
+      </w:r>
+    </w:p>
+    <w:p>
+      <w:pPr>
+        <w:pStyle w:val="Heading1"/>
+      </w:pPr>
+      <w:r>
         <w:t>2. Runtime Performance</w:t>
       </w:r>
     </w:p>
@@ -607,7 +714,7 @@
         <w:drawing>
           <wp:inline xmlns:a="http://schemas.openxmlformats.org/drawingml/2006/main" xmlns:pic="http://schemas.openxmlformats.org/drawingml/2006/picture">
             <wp:extent cx="5486400" cy="3480309"/>
-            <wp:docPr id="1" name="Picture 1"/>
+            <wp:docPr id="3" name="Picture 3"/>
             <wp:cNvGraphicFramePr>
               <a:graphicFrameLocks noChangeAspect="1"/>
             </wp:cNvGraphicFramePr>
@@ -619,7 +726,7 @@
                     <pic:cNvPicPr/>
                   </pic:nvPicPr>
                   <pic:blipFill>
-                    <a:blip r:embed="rId9"/>
+                    <a:blip r:embed="rId11"/>
                     <a:stretch>
                       <a:fillRect/>
                     </a:stretch>
@@ -895,7 +1002,7 @@
         <w:drawing>
           <wp:inline xmlns:a="http://schemas.openxmlformats.org/drawingml/2006/main" xmlns:pic="http://schemas.openxmlformats.org/drawingml/2006/picture">
             <wp:extent cx="5486400" cy="3436850"/>
-            <wp:docPr id="2" name="Picture 2"/>
+            <wp:docPr id="4" name="Picture 4"/>
             <wp:cNvGraphicFramePr>
               <a:graphicFrameLocks noChangeAspect="1"/>
             </wp:cNvGraphicFramePr>
@@ -907,7 +1014,7 @@
                     <pic:cNvPicPr/>
                   </pic:nvPicPr>
                   <pic:blipFill>
-                    <a:blip r:embed="rId10"/>
+                    <a:blip r:embed="rId12"/>
                     <a:stretch>
                       <a:fillRect/>
                     </a:stretch>
@@ -956,7 +1063,7 @@
         <w:drawing>
           <wp:inline xmlns:a="http://schemas.openxmlformats.org/drawingml/2006/main" xmlns:pic="http://schemas.openxmlformats.org/drawingml/2006/picture">
             <wp:extent cx="5486400" cy="3394463"/>
-            <wp:docPr id="3" name="Picture 3"/>
+            <wp:docPr id="5" name="Picture 5"/>
             <wp:cNvGraphicFramePr>
               <a:graphicFrameLocks noChangeAspect="1"/>
             </wp:cNvGraphicFramePr>
@@ -968,7 +1075,7 @@
                     <pic:cNvPicPr/>
                   </pic:nvPicPr>
                   <pic:blipFill>
-                    <a:blip r:embed="rId11"/>
+                    <a:blip r:embed="rId13"/>
                     <a:stretch>
                       <a:fillRect/>
                     </a:stretch>
@@ -1415,7 +1522,7 @@
         <w:drawing>
           <wp:inline xmlns:a="http://schemas.openxmlformats.org/drawingml/2006/main" xmlns:pic="http://schemas.openxmlformats.org/drawingml/2006/picture">
             <wp:extent cx="5486400" cy="3414378"/>
-            <wp:docPr id="4" name="Picture 4"/>
+            <wp:docPr id="6" name="Picture 6"/>
             <wp:cNvGraphicFramePr>
               <a:graphicFrameLocks noChangeAspect="1"/>
             </wp:cNvGraphicFramePr>
@@ -1427,7 +1534,7 @@
                     <pic:cNvPicPr/>
                   </pic:nvPicPr>
                   <pic:blipFill>
-                    <a:blip r:embed="rId12"/>
+                    <a:blip r:embed="rId14"/>
                     <a:stretch>
                       <a:fillRect/>
                     </a:stretch>

</xml_diff>